<commit_message>
docs: complete Table C (Tiga Invariant) in Working-Paper-Praktik-2-Sesi-3.docx
</commit_message>
<xml_diff>
--- a/Working-Paper-Praktik-2-Sesi-3.docx
+++ b/Working-Paper-Praktik-2-Sesi-3.docx
@@ -217,6 +217,7 @@
               <w:rPr>
                 <w:rtl w:val="0"/>
               </w:rPr>
+              <w:t xml:space="preserve">Nurul Izzah</w:t>
             </w:r>
           </w:p>
         </w:tc>
@@ -269,6 +270,7 @@
               <w:rPr>
                 <w:rtl w:val="0"/>
               </w:rPr>
+              <w:t xml:space="preserve">02 Oktober 2026</w:t>
             </w:r>
           </w:p>
         </w:tc>
@@ -321,6 +323,7 @@
               <w:rPr>
                 <w:rtl w:val="0"/>
               </w:rPr>
+              <w:t xml:space="preserve">3</w:t>
             </w:r>
           </w:p>
         </w:tc>
@@ -373,6 +376,7 @@
               <w:rPr>
                 <w:rtl w:val="0"/>
               </w:rPr>
+              <w:t xml:space="preserve">dapur-nia</w:t>
             </w:r>
           </w:p>
         </w:tc>
@@ -425,6 +429,7 @@
               <w:rPr>
                 <w:rtl w:val="0"/>
               </w:rPr>
+              <w:t xml:space="preserve">dapur-nia</w:t>
             </w:r>
           </w:p>
         </w:tc>
@@ -843,6 +848,7 @@
               <w:rPr>
                 <w:rtl w:val="0"/>
               </w:rPr>
+              <w:t xml:space="preserve">menu</w:t>
             </w:r>
           </w:p>
         </w:tc>
@@ -859,6 +865,7 @@
               <w:rPr>
                 <w:rtl w:val="0"/>
               </w:rPr>
+              <w:t xml:space="preserve">menu-1</w:t>
             </w:r>
           </w:p>
         </w:tc>
@@ -883,7 +890,31 @@
                 <w:szCs w:val="20"/>
                 <w:rtl w:val="0"/>
               </w:rPr>
-              <w:t xml:space="preserve">[ ]</w:t>
+              <w:t xml:space="preserve">[</w:t>
+            </w:r>
+            <w:r>
+              <w:rPr>
+                <w:rFonts w:ascii="Arial" w:cs="Arial" w:eastAsia="Arial" w:hAnsi="Arial"/>
+                <w:color w:val="333333"/>
+                <w:sz w:val="20"/>
+                <w:szCs w:val="20"/>
+                <w:rtl w:val="0"/>
+              </w:rPr>
+              <w:t xml:space="preserve">✔️</w:t>
+            </w:r>
+            <w:r>
+              <w:rPr>
+                <w:rFonts w:ascii="Arial" w:cs="Arial" w:eastAsia="Arial" w:hAnsi="Arial"/>
+                <w:b w:val="0"/>
+                <w:bCs w:val="0"/>
+                <w:i w:val="0"/>
+                <w:iCs w:val="0"/>
+                <w:color w:val="333333"/>
+                <w:sz w:val="20"/>
+                <w:szCs w:val="20"/>
+                <w:rtl w:val="0"/>
+              </w:rPr>
+              <w:t xml:space="preserve">]</w:t>
             </w:r>
             <w:r>
               <w:rPr>
@@ -913,7 +944,31 @@
                 <w:szCs w:val="20"/>
                 <w:rtl w:val="0"/>
               </w:rPr>
-              <w:t xml:space="preserve">[ ]</w:t>
+              <w:t xml:space="preserve">[</w:t>
+            </w:r>
+            <w:r>
+              <w:rPr>
+                <w:rFonts w:ascii="Arial" w:cs="Arial" w:eastAsia="Arial" w:hAnsi="Arial"/>
+                <w:color w:val="333333"/>
+                <w:sz w:val="20"/>
+                <w:szCs w:val="20"/>
+                <w:rtl w:val="0"/>
+              </w:rPr>
+              <w:t xml:space="preserve">✔️</w:t>
+            </w:r>
+            <w:r>
+              <w:rPr>
+                <w:rFonts w:ascii="Arial" w:cs="Arial" w:eastAsia="Arial" w:hAnsi="Arial"/>
+                <w:b w:val="0"/>
+                <w:bCs w:val="0"/>
+                <w:i w:val="0"/>
+                <w:iCs w:val="0"/>
+                <w:color w:val="333333"/>
+                <w:sz w:val="20"/>
+                <w:szCs w:val="20"/>
+                <w:rtl w:val="0"/>
+              </w:rPr>
+              <w:t xml:space="preserve">]</w:t>
             </w:r>
             <w:r>
               <w:rPr>
@@ -935,6 +990,7 @@
               <w:rPr>
                 <w:rtl w:val="0"/>
               </w:rPr>
+              <w:t xml:space="preserve">Nama dokumen berurutan sesuai yang ditambahkan</w:t>
             </w:r>
           </w:p>
         </w:tc>
@@ -987,6 +1043,7 @@
               <w:rPr>
                 <w:rtl w:val="0"/>
               </w:rPr>
+              <w:t xml:space="preserve">pelanggan</w:t>
             </w:r>
           </w:p>
         </w:tc>
@@ -1003,6 +1060,7 @@
               <w:rPr>
                 <w:rtl w:val="0"/>
               </w:rPr>
+              <w:t xml:space="preserve">0811111111</w:t>
             </w:r>
           </w:p>
         </w:tc>
@@ -1027,7 +1085,31 @@
                 <w:szCs w:val="20"/>
                 <w:rtl w:val="0"/>
               </w:rPr>
-              <w:t xml:space="preserve">[ ]</w:t>
+              <w:t xml:space="preserve">[</w:t>
+            </w:r>
+            <w:r>
+              <w:rPr>
+                <w:rFonts w:ascii="Arial" w:cs="Arial" w:eastAsia="Arial" w:hAnsi="Arial"/>
+                <w:color w:val="333333"/>
+                <w:sz w:val="20"/>
+                <w:szCs w:val="20"/>
+                <w:rtl w:val="0"/>
+              </w:rPr>
+              <w:t xml:space="preserve">✔️</w:t>
+            </w:r>
+            <w:r>
+              <w:rPr>
+                <w:rFonts w:ascii="Arial" w:cs="Arial" w:eastAsia="Arial" w:hAnsi="Arial"/>
+                <w:b w:val="0"/>
+                <w:bCs w:val="0"/>
+                <w:i w:val="0"/>
+                <w:iCs w:val="0"/>
+                <w:color w:val="333333"/>
+                <w:sz w:val="20"/>
+                <w:szCs w:val="20"/>
+                <w:rtl w:val="0"/>
+              </w:rPr>
+              <w:t xml:space="preserve"> ]</w:t>
             </w:r>
             <w:r>
               <w:rPr>
@@ -1057,7 +1139,31 @@
                 <w:szCs w:val="20"/>
                 <w:rtl w:val="0"/>
               </w:rPr>
-              <w:t xml:space="preserve">[ ]</w:t>
+              <w:t xml:space="preserve">[</w:t>
+            </w:r>
+            <w:r>
+              <w:rPr>
+                <w:rFonts w:ascii="Arial" w:cs="Arial" w:eastAsia="Arial" w:hAnsi="Arial"/>
+                <w:color w:val="333333"/>
+                <w:sz w:val="20"/>
+                <w:szCs w:val="20"/>
+                <w:rtl w:val="0"/>
+              </w:rPr>
+              <w:t xml:space="preserve">✔️</w:t>
+            </w:r>
+            <w:r>
+              <w:rPr>
+                <w:rFonts w:ascii="Arial" w:cs="Arial" w:eastAsia="Arial" w:hAnsi="Arial"/>
+                <w:b w:val="0"/>
+                <w:bCs w:val="0"/>
+                <w:i w:val="0"/>
+                <w:iCs w:val="0"/>
+                <w:color w:val="333333"/>
+                <w:sz w:val="20"/>
+                <w:szCs w:val="20"/>
+                <w:rtl w:val="0"/>
+              </w:rPr>
+              <w:t xml:space="preserve"> ]</w:t>
             </w:r>
             <w:r>
               <w:rPr>
@@ -1131,6 +1237,7 @@
               <w:rPr>
                 <w:rtl w:val="0"/>
               </w:rPr>
+              <w:t xml:space="preserve">pesanan</w:t>
             </w:r>
           </w:p>
         </w:tc>
@@ -1147,6 +1254,7 @@
               <w:rPr>
                 <w:rtl w:val="0"/>
               </w:rPr>
+              <w:t xml:space="preserve">order-1</w:t>
             </w:r>
           </w:p>
         </w:tc>
@@ -1216,13 +1324,13 @@
           </w:tcPr>
           <w:p>
             <w:pPr>
-              <w:spacing w:after="0" w:lineRule="auto"/>
               <w:rPr/>
             </w:pPr>
             <w:r>
               <w:rPr>
                 <w:rtl w:val="0"/>
               </w:rPr>
+              <w:t xml:space="preserve">Nama dokumen berurutan sesuai yang ditambahkan</w:t>
             </w:r>
           </w:p>
         </w:tc>
@@ -1471,6 +1579,7 @@
               <w:rPr>
                 <w:rtl w:val="0"/>
               </w:rPr>
+              <w:t xml:space="preserve">Menambah menu bandeng presto</w:t>
             </w:r>
           </w:p>
         </w:tc>
@@ -1487,6 +1596,7 @@
               <w:rPr>
                 <w:rtl w:val="0"/>
               </w:rPr>
+              <w:t xml:space="preserve">Ada alert data berhasil ditambahkan</w:t>
             </w:r>
           </w:p>
         </w:tc>
@@ -1502,21 +1612,18 @@
             <w:r>
               <w:rPr>
                 <w:rFonts w:ascii="Arial" w:cs="Arial" w:eastAsia="Arial" w:hAnsi="Arial"/>
-                <w:b w:val="0"/>
-                <w:bCs w:val="0"/>
-                <w:i w:val="0"/>
-                <w:iCs w:val="0"/>
                 <w:color w:val="333333"/>
                 <w:sz w:val="20"/>
                 <w:szCs w:val="20"/>
                 <w:rtl w:val="0"/>
               </w:rPr>
-              <w:t xml:space="preserve">[ ]</w:t>
+              <w:t xml:space="preserve">✔️</w:t>
             </w:r>
             <w:r>
               <w:rPr>
                 <w:rtl w:val="0"/>
               </w:rPr>
+              <w:t xml:space="preserve"> </w:t>
             </w:r>
           </w:p>
         </w:tc>
@@ -1569,6 +1676,7 @@
               <w:rPr>
                 <w:rtl w:val="0"/>
               </w:rPr>
+              <w:t xml:space="preserve">Membaca pesanan yang baru ditambahkan oleh pelanggan Nurul Izzah memesan bandeng presto</w:t>
             </w:r>
           </w:p>
         </w:tc>
@@ -1585,6 +1693,7 @@
               <w:rPr>
                 <w:rtl w:val="0"/>
               </w:rPr>
+              <w:t xml:space="preserve">Tampil</w:t>
             </w:r>
           </w:p>
         </w:tc>
@@ -1594,27 +1703,23 @@
           </w:tcPr>
           <w:p>
             <w:pPr>
-              <w:spacing w:after="0" w:lineRule="auto"/>
               <w:rPr/>
             </w:pPr>
             <w:r>
               <w:rPr>
                 <w:rFonts w:ascii="Arial" w:cs="Arial" w:eastAsia="Arial" w:hAnsi="Arial"/>
-                <w:b w:val="0"/>
-                <w:bCs w:val="0"/>
-                <w:i w:val="0"/>
-                <w:iCs w:val="0"/>
                 <w:color w:val="333333"/>
                 <w:sz w:val="20"/>
                 <w:szCs w:val="20"/>
                 <w:rtl w:val="0"/>
               </w:rPr>
-              <w:t xml:space="preserve">[ ]</w:t>
+              <w:t xml:space="preserve">✔️</w:t>
             </w:r>
             <w:r>
               <w:rPr>
                 <w:rtl w:val="0"/>
               </w:rPr>
+              <w:t xml:space="preserve"> </w:t>
             </w:r>
           </w:p>
         </w:tc>
@@ -1667,6 +1772,7 @@
               <w:rPr>
                 <w:rtl w:val="0"/>
               </w:rPr>
+              <w:t xml:space="preserve">Mengubah status pesanan dari belum dibayar menjadi bayar</w:t>
             </w:r>
           </w:p>
         </w:tc>
@@ -1683,6 +1789,7 @@
               <w:rPr>
                 <w:rtl w:val="0"/>
               </w:rPr>
+              <w:t xml:space="preserve">Ada alert berhasil diubah, badge pill berubah dari belum dibayar menjadi sudah dibayar</w:t>
             </w:r>
           </w:p>
         </w:tc>
@@ -1692,27 +1799,23 @@
           </w:tcPr>
           <w:p>
             <w:pPr>
-              <w:spacing w:after="0" w:lineRule="auto"/>
               <w:rPr/>
             </w:pPr>
             <w:r>
               <w:rPr>
                 <w:rFonts w:ascii="Arial" w:cs="Arial" w:eastAsia="Arial" w:hAnsi="Arial"/>
-                <w:b w:val="0"/>
-                <w:bCs w:val="0"/>
-                <w:i w:val="0"/>
-                <w:iCs w:val="0"/>
                 <w:color w:val="333333"/>
                 <w:sz w:val="20"/>
                 <w:szCs w:val="20"/>
                 <w:rtl w:val="0"/>
               </w:rPr>
-              <w:t xml:space="preserve">[ ]</w:t>
+              <w:t xml:space="preserve">✔️</w:t>
             </w:r>
             <w:r>
               <w:rPr>
                 <w:rtl w:val="0"/>
               </w:rPr>
+              <w:t xml:space="preserve"> </w:t>
             </w:r>
           </w:p>
         </w:tc>
@@ -1765,6 +1868,7 @@
               <w:rPr>
                 <w:rtl w:val="0"/>
               </w:rPr>
+              <w:t xml:space="preserve">Menghapus menu bandeng presto</w:t>
             </w:r>
           </w:p>
         </w:tc>
@@ -1781,6 +1885,7 @@
               <w:rPr>
                 <w:rtl w:val="0"/>
               </w:rPr>
+              <w:t xml:space="preserve">Ada alert menu berhasil dihapus</w:t>
             </w:r>
           </w:p>
         </w:tc>
@@ -1790,27 +1895,23 @@
           </w:tcPr>
           <w:p>
             <w:pPr>
-              <w:spacing w:after="0" w:lineRule="auto"/>
               <w:rPr/>
             </w:pPr>
             <w:r>
               <w:rPr>
                 <w:rFonts w:ascii="Arial" w:cs="Arial" w:eastAsia="Arial" w:hAnsi="Arial"/>
-                <w:b w:val="0"/>
-                <w:bCs w:val="0"/>
-                <w:i w:val="0"/>
-                <w:iCs w:val="0"/>
                 <w:color w:val="333333"/>
                 <w:sz w:val="20"/>
                 <w:szCs w:val="20"/>
                 <w:rtl w:val="0"/>
               </w:rPr>
-              <w:t xml:space="preserve">[ ]</w:t>
+              <w:t xml:space="preserve">✔️</w:t>
             </w:r>
             <w:r>
               <w:rPr>
                 <w:rtl w:val="0"/>
               </w:rPr>
+              <w:t xml:space="preserve"> </w:t>
             </w:r>
           </w:p>
         </w:tc>
@@ -2067,27 +2168,17 @@
           </w:tcPr>
           <w:p>
             <w:pPr>
-              <w:spacing w:after="0" w:lineRule="auto"/>
-              <w:rPr/>
+              <w:spacing w:before="40" w:after="40"/>
+              <w:jc w:val="center"/>
             </w:pPr>
+            <w:r/>
             <w:r>
               <w:rPr>
-                <w:rFonts w:ascii="Arial" w:cs="Arial" w:eastAsia="Arial" w:hAnsi="Arial"/>
+                <w:rFonts w:ascii="Arial" w:hAnsi="Arial"/>
                 <w:b w:val="0"/>
-                <w:bCs w:val="0"/>
-                <w:i w:val="0"/>
-                <w:iCs w:val="0"/>
-                <w:color w:val="333333"/>
                 <w:sz w:val="20"/>
-                <w:szCs w:val="20"/>
-                <w:rtl w:val="0"/>
               </w:rPr>
-              <w:t xml:space="preserve">1</w:t>
-            </w:r>
-            <w:r>
-              <w:rPr>
-                <w:rtl w:val="0"/>
-              </w:rPr>
+              <w:t>1</w:t>
             </w:r>
           </w:p>
         </w:tc>
@@ -2097,13 +2188,17 @@
           </w:tcPr>
           <w:p>
             <w:pPr>
-              <w:spacing w:after="0" w:lineRule="auto"/>
-              <w:rPr/>
+              <w:spacing w:before="40" w:after="40"/>
+              <w:jc w:val="left"/>
             </w:pPr>
+            <w:r/>
             <w:r>
               <w:rPr>
-                <w:rtl w:val="0"/>
+                <w:rFonts w:ascii="Arial" w:hAnsi="Arial"/>
+                <w:b w:val="0"/>
+                <w:sz w:val="20"/>
               </w:rPr>
+              <w:t>Total tagihan tidak boleh kurang dari nol</w:t>
             </w:r>
           </w:p>
         </w:tc>
@@ -2113,13 +2208,17 @@
           </w:tcPr>
           <w:p>
             <w:pPr>
-              <w:spacing w:after="0" w:lineRule="auto"/>
-              <w:rPr/>
+              <w:spacing w:before="40" w:after="40"/>
+              <w:jc w:val="left"/>
             </w:pPr>
+            <w:r/>
             <w:r>
               <w:rPr>
-                <w:rtl w:val="0"/>
+                <w:rFonts w:ascii="Arial" w:hAnsi="Arial"/>
+                <w:b w:val="0"/>
+                <w:sz w:val="20"/>
               </w:rPr>
+              <w:t>Laporan penjualan mencatat pendapatan negatif dan rekapitulasi harian tidak dapat dipakai.</w:t>
             </w:r>
           </w:p>
         </w:tc>
@@ -2129,13 +2228,17 @@
           </w:tcPr>
           <w:p>
             <w:pPr>
-              <w:spacing w:after="0" w:lineRule="auto"/>
-              <w:rPr/>
+              <w:spacing w:before="40" w:after="40"/>
+              <w:jc w:val="left"/>
             </w:pPr>
+            <w:r/>
             <w:r>
               <w:rPr>
-                <w:rtl w:val="0"/>
+                <w:rFonts w:ascii="Arial" w:hAnsi="Arial"/>
+                <w:b w:val="0"/>
+                <w:sz w:val="20"/>
               </w:rPr>
+              <w:t>Fungsi validasi validatePesananInput &amp; calculateOrderTotal (src/lib/validation.ts) serta createPesanan (src/services/pesananService.ts). Total tagihan dihitung otomatis dari subtotal menu ditambah ongkir minimal Rp 10.000, serta menolak nilai negatif.</w:t>
             </w:r>
           </w:p>
         </w:tc>
@@ -2145,13 +2248,17 @@
           </w:tcPr>
           <w:p>
             <w:pPr>
-              <w:spacing w:after="0" w:lineRule="auto"/>
-              <w:rPr/>
+              <w:spacing w:before="40" w:after="40"/>
+              <w:jc w:val="left"/>
             </w:pPr>
+            <w:r/>
             <w:r>
               <w:rPr>
-                <w:rtl w:val="0"/>
+                <w:rFonts w:ascii="Arial" w:hAnsi="Arial"/>
+                <w:b w:val="0"/>
+                <w:sz w:val="20"/>
               </w:rPr>
+              <w:t>Lolos uji unit test otomatis (Vitest: src/test/validation.test.ts) dan form pesanan di UI menolak pesanan jika total atau ongkir tidak valid.</w:t>
             </w:r>
           </w:p>
         </w:tc>
@@ -2167,27 +2274,17 @@
           </w:tcPr>
           <w:p>
             <w:pPr>
-              <w:spacing w:after="0" w:lineRule="auto"/>
-              <w:rPr/>
+              <w:spacing w:before="40" w:after="40"/>
+              <w:jc w:val="center"/>
             </w:pPr>
+            <w:r/>
             <w:r>
               <w:rPr>
-                <w:rFonts w:ascii="Arial" w:cs="Arial" w:eastAsia="Arial" w:hAnsi="Arial"/>
+                <w:rFonts w:ascii="Arial" w:hAnsi="Arial"/>
                 <w:b w:val="0"/>
-                <w:bCs w:val="0"/>
-                <w:i w:val="0"/>
-                <w:iCs w:val="0"/>
-                <w:color w:val="333333"/>
                 <w:sz w:val="20"/>
-                <w:szCs w:val="20"/>
-                <w:rtl w:val="0"/>
               </w:rPr>
-              <w:t xml:space="preserve">2</w:t>
-            </w:r>
-            <w:r>
-              <w:rPr>
-                <w:rtl w:val="0"/>
-              </w:rPr>
+              <w:t>2</w:t>
             </w:r>
           </w:p>
         </w:tc>
@@ -2197,13 +2294,17 @@
           </w:tcPr>
           <w:p>
             <w:pPr>
-              <w:spacing w:after="0" w:lineRule="auto"/>
-              <w:rPr/>
+              <w:spacing w:before="40" w:after="40"/>
+              <w:jc w:val="left"/>
             </w:pPr>
+            <w:r/>
             <w:r>
               <w:rPr>
-                <w:rtl w:val="0"/>
+                <w:rFonts w:ascii="Arial" w:hAnsi="Arial"/>
+                <w:b w:val="0"/>
+                <w:sz w:val="20"/>
               </w:rPr>
+              <w:t>Sisa porsi tidak boleh kurang dari nol</w:t>
             </w:r>
           </w:p>
         </w:tc>
@@ -2213,13 +2314,17 @@
           </w:tcPr>
           <w:p>
             <w:pPr>
-              <w:spacing w:after="0" w:lineRule="auto"/>
-              <w:rPr/>
+              <w:spacing w:before="40" w:after="40"/>
+              <w:jc w:val="left"/>
             </w:pPr>
+            <w:r/>
             <w:r>
               <w:rPr>
-                <w:rtl w:val="0"/>
+                <w:rFonts w:ascii="Arial" w:hAnsi="Arial"/>
+                <w:b w:val="0"/>
+                <w:sz w:val="20"/>
               </w:rPr>
+              <w:t>Dapur menerima pesanan yang bahannya tidak tersedia.</w:t>
             </w:r>
           </w:p>
         </w:tc>
@@ -2229,13 +2334,17 @@
           </w:tcPr>
           <w:p>
             <w:pPr>
-              <w:spacing w:after="0" w:lineRule="auto"/>
-              <w:rPr/>
+              <w:spacing w:before="40" w:after="40"/>
+              <w:jc w:val="left"/>
             </w:pPr>
+            <w:r/>
             <w:r>
               <w:rPr>
-                <w:rtl w:val="0"/>
+                <w:rFonts w:ascii="Arial" w:hAnsi="Arial"/>
+                <w:b w:val="0"/>
+                <w:sz w:val="20"/>
               </w:rPr>
+              <w:t>Validasi validateMenuInput (src/lib/validation.ts) menolak sisa porsi negatif. createPesanan (src/services/pesananService.ts) memverifikasi stok sebelum pesanan dibuat dan memotong porsi secara aman. Tombol pesan di UI (MenuCard.tsx) dinonaktifkan saat porsi habis.</w:t>
             </w:r>
           </w:p>
         </w:tc>
@@ -2245,13 +2354,17 @@
           </w:tcPr>
           <w:p>
             <w:pPr>
-              <w:spacing w:after="0" w:lineRule="auto"/>
-              <w:rPr/>
+              <w:spacing w:before="40" w:after="40"/>
+              <w:jc w:val="left"/>
             </w:pPr>
+            <w:r/>
             <w:r>
               <w:rPr>
-                <w:rtl w:val="0"/>
+                <w:rFonts w:ascii="Arial" w:hAnsi="Arial"/>
+                <w:b w:val="0"/>
+                <w:sz w:val="20"/>
               </w:rPr>
+              <w:t>Lolos uji unit test otomatis (Vitest: src/test/validation.test.ts) dan sistem di UI menolak pemesanan jika jumlah porsi melebihi stok yang tersedia.</w:t>
             </w:r>
           </w:p>
         </w:tc>
@@ -2267,27 +2380,17 @@
           </w:tcPr>
           <w:p>
             <w:pPr>
-              <w:spacing w:after="0" w:lineRule="auto"/>
-              <w:rPr/>
+              <w:spacing w:before="40" w:after="40"/>
+              <w:jc w:val="center"/>
             </w:pPr>
+            <w:r/>
             <w:r>
               <w:rPr>
-                <w:rFonts w:ascii="Arial" w:cs="Arial" w:eastAsia="Arial" w:hAnsi="Arial"/>
+                <w:rFonts w:ascii="Arial" w:hAnsi="Arial"/>
                 <w:b w:val="0"/>
-                <w:bCs w:val="0"/>
-                <w:i w:val="0"/>
-                <w:iCs w:val="0"/>
-                <w:color w:val="333333"/>
                 <w:sz w:val="20"/>
-                <w:szCs w:val="20"/>
-                <w:rtl w:val="0"/>
               </w:rPr>
-              <w:t xml:space="preserve">3</w:t>
-            </w:r>
-            <w:r>
-              <w:rPr>
-                <w:rtl w:val="0"/>
-              </w:rPr>
+              <w:t>3</w:t>
             </w:r>
           </w:p>
         </w:tc>
@@ -2297,13 +2400,17 @@
           </w:tcPr>
           <w:p>
             <w:pPr>
-              <w:spacing w:after="0" w:lineRule="auto"/>
-              <w:rPr/>
+              <w:spacing w:before="40" w:after="40"/>
+              <w:jc w:val="left"/>
             </w:pPr>
+            <w:r/>
             <w:r>
               <w:rPr>
-                <w:rtl w:val="0"/>
+                <w:rFonts w:ascii="Arial" w:hAnsi="Arial"/>
+                <w:b w:val="0"/>
+                <w:sz w:val="20"/>
               </w:rPr>
+              <w:t>Status pesanan tidak boleh melompat</w:t>
             </w:r>
           </w:p>
         </w:tc>
@@ -2313,13 +2420,17 @@
           </w:tcPr>
           <w:p>
             <w:pPr>
-              <w:spacing w:after="0" w:lineRule="auto"/>
-              <w:rPr/>
+              <w:spacing w:before="40" w:after="40"/>
+              <w:jc w:val="left"/>
             </w:pPr>
+            <w:r/>
             <w:r>
               <w:rPr>
-                <w:rtl w:val="0"/>
+                <w:rFonts w:ascii="Arial" w:hAnsi="Arial"/>
+                <w:b w:val="0"/>
+                <w:sz w:val="20"/>
               </w:rPr>
+              <w:t>Pesanan tercatat selesai tanpa pernah dimasak atau dibayar.</w:t>
             </w:r>
           </w:p>
         </w:tc>
@@ -2329,13 +2440,17 @@
           </w:tcPr>
           <w:p>
             <w:pPr>
-              <w:spacing w:after="0" w:lineRule="auto"/>
-              <w:rPr/>
+              <w:spacing w:before="40" w:after="40"/>
+              <w:jc w:val="left"/>
             </w:pPr>
+            <w:r/>
             <w:r>
               <w:rPr>
-                <w:rtl w:val="0"/>
+                <w:rFonts w:ascii="Arial" w:hAnsi="Arial"/>
+                <w:b w:val="0"/>
+                <w:sz w:val="20"/>
               </w:rPr>
+              <w:t>Mesin status canTransitionStatus (src/lib/validation.ts) dengan aturan ketat: menunggu_bayar -&gt; dibayar -&gt; diproses -&gt; selesai (atau dibatalkan), ditegakkan pada updatePesananStatus (src/services/pesananService.ts), dan tombol aksi UI hanya menampilkan tahap berikutnya.</w:t>
             </w:r>
           </w:p>
         </w:tc>
@@ -2345,13 +2460,17 @@
           </w:tcPr>
           <w:p>
             <w:pPr>
-              <w:spacing w:after="0" w:lineRule="auto"/>
-              <w:rPr/>
+              <w:spacing w:before="40" w:after="40"/>
+              <w:jc w:val="left"/>
             </w:pPr>
+            <w:r/>
             <w:r>
               <w:rPr>
-                <w:rtl w:val="0"/>
+                <w:rFonts w:ascii="Arial" w:hAnsi="Arial"/>
+                <w:b w:val="0"/>
+                <w:sz w:val="20"/>
               </w:rPr>
+              <w:t>Lolos uji unit test otomatis (Vitest: src/test/validation.test.ts) dan antarmuka web hanya mengizinkan perpindahan status yang berurutan sesuai alur.</w:t>
             </w:r>
           </w:p>
         </w:tc>
@@ -2384,7 +2503,6 @@
     <w:pPr>
       <w:keepNext w:val="0"/>
       <w:keepLines w:val="0"/>
-      <w:pageBreakBefore w:val="0"/>
       <w:widowControl w:val="1"/>
       <w:pBdr>
         <w:top w:space="0" w:sz="0" w:val="nil"/>
@@ -2432,7 +2550,6 @@
     <w:pPr>
       <w:keepNext w:val="0"/>
       <w:keepLines w:val="0"/>
-      <w:pageBreakBefore w:val="0"/>
       <w:widowControl w:val="1"/>
       <w:pBdr>
         <w:top w:space="0" w:sz="0" w:val="nil"/>
@@ -2485,7 +2602,7 @@
         <wp:inline distB="0" distT="0" distL="114300" distR="114300">
           <wp:extent cx="1170432" cy="630936"/>
           <wp:effectExtent b="0" l="0" r="0" t="0"/>
-          <wp:docPr id="2" name="image1.png"/>
+          <wp:docPr id="3" name="image1.png"/>
           <a:graphic>
             <a:graphicData uri="http://schemas.openxmlformats.org/drawingml/2006/picture">
               <pic:pic>
@@ -2674,6 +2791,20 @@
       <w:sz w:val="52"/>
       <w:szCs w:val="52"/>
     </w:rPr>
+  </w:style>
+  <w:style w:type="table" w:styleId="TableNormal" w:default="1">
+    <w:name w:val="TableNormal"/>
+    <w:tblPr>
+      <w:tblCellMar>
+        <w:top w:w="100.0" w:type="dxa"/>
+        <w:left w:w="100.0" w:type="dxa"/>
+        <w:bottom w:w="100.0" w:type="dxa"/>
+        <w:right w:w="100.0" w:type="dxa"/>
+      </w:tblCellMar>
+    </w:tblPr>
+  </w:style>
+  <w:style w:type="paragraph" w:styleId="Normal" w:default="1">
+    <w:name w:val="normal"/>
   </w:style>
   <w:style w:type="paragraph" w:styleId="Header">
     <w:name w:val="header"/>
@@ -14171,6 +14302,70 @@
         <w:shd w:color="auto" w:fill="fbcaa2" w:themeFill="accent6" w:themeFillTint="00007F" w:val="clear"/>
       </w:tcPr>
     </w:tblStylePr>
+  </w:style>
+  <w:style w:type="table" w:styleId="Table1">
+    <w:basedOn w:val="TableNormal"/>
+    <w:pPr>
+      <w:spacing w:after="0" w:line="240" w:lineRule="auto"/>
+    </w:pPr>
+    <w:tblPr>
+      <w:tblStyleRowBandSize w:val="1"/>
+      <w:tblStyleColBandSize w:val="1"/>
+      <w:tblCellMar>
+        <w:top w:w="0.0" w:type="dxa"/>
+        <w:left w:w="108.0" w:type="dxa"/>
+        <w:bottom w:w="0.0" w:type="dxa"/>
+        <w:right w:w="108.0" w:type="dxa"/>
+      </w:tblCellMar>
+    </w:tblPr>
+  </w:style>
+  <w:style w:type="table" w:styleId="Table2">
+    <w:basedOn w:val="TableNormal"/>
+    <w:pPr>
+      <w:spacing w:after="0" w:line="240" w:lineRule="auto"/>
+    </w:pPr>
+    <w:tblPr>
+      <w:tblStyleRowBandSize w:val="1"/>
+      <w:tblStyleColBandSize w:val="1"/>
+      <w:tblCellMar>
+        <w:top w:w="0.0" w:type="dxa"/>
+        <w:left w:w="108.0" w:type="dxa"/>
+        <w:bottom w:w="0.0" w:type="dxa"/>
+        <w:right w:w="108.0" w:type="dxa"/>
+      </w:tblCellMar>
+    </w:tblPr>
+  </w:style>
+  <w:style w:type="table" w:styleId="Table3">
+    <w:basedOn w:val="TableNormal"/>
+    <w:pPr>
+      <w:spacing w:after="0" w:line="240" w:lineRule="auto"/>
+    </w:pPr>
+    <w:tblPr>
+      <w:tblStyleRowBandSize w:val="1"/>
+      <w:tblStyleColBandSize w:val="1"/>
+      <w:tblCellMar>
+        <w:top w:w="0.0" w:type="dxa"/>
+        <w:left w:w="108.0" w:type="dxa"/>
+        <w:bottom w:w="0.0" w:type="dxa"/>
+        <w:right w:w="108.0" w:type="dxa"/>
+      </w:tblCellMar>
+    </w:tblPr>
+  </w:style>
+  <w:style w:type="table" w:styleId="Table4">
+    <w:basedOn w:val="TableNormal"/>
+    <w:pPr>
+      <w:spacing w:after="0" w:line="240" w:lineRule="auto"/>
+    </w:pPr>
+    <w:tblPr>
+      <w:tblStyleRowBandSize w:val="1"/>
+      <w:tblStyleColBandSize w:val="1"/>
+      <w:tblCellMar>
+        <w:top w:w="0.0" w:type="dxa"/>
+        <w:left w:w="108.0" w:type="dxa"/>
+        <w:bottom w:w="0.0" w:type="dxa"/>
+        <w:right w:w="108.0" w:type="dxa"/>
+      </w:tblCellMar>
+    </w:tblPr>
   </w:style>
   <w:style w:type="paragraph" w:styleId="Subtitle">
     <w:name w:val="Subtitle"/>
@@ -14575,7 +14770,7 @@
 
 <file path=customXML/item1.xml><?xml version="1.0" encoding="utf-8"?>
 <go:gDocsCustomXmlDataStorage xmlns:go="http://customooxmlschemas.google.com/" xmlns:r="http://schemas.openxmlformats.org/officeDocument/2006/relationships" uri="GoogleDocsCustomDataVersion2">
-  <go:docsCustomData xmlns:go="http://customooxmlschemas.google.com/" roundtripDataSignature="AMtx7mid2IqgZ9wEjcECu/+JmEyyCVLSEA==">CgMxLjA4AHIhMVZoYW1oeG9OQkktS1ZSTlhGdTQ4cEZPWmNSM1VFcW9n</go:docsCustomData>
+  <go:docsCustomData xmlns:go="http://customooxmlschemas.google.com/" roundtripDataSignature="AMtx7mhYqZiHMdgg4T3JA8c+KQsTKE1kLQ==">CgMxLjA4AHIhMXN0cUxGOE5NYzJ3TWxjeHFOMkw3Ukk1ZGJ3STVGMW1p</go:docsCustomData>
 </go:gDocsCustomXmlDataStorage>
 </file>
 

</xml_diff>